<commit_message>
feat: update Lesson 8 materials to enhance opinion-building framework and clarify evaluation criteria
</commit_message>
<xml_diff>
--- a/Units/English/English_Unit_3/Lesson_Plans/Lesson_8/Lesson_8_Lucas_Handout.docx
+++ b/Units/English/English_Unit_3/Lesson_Plans/Lesson_8/Lesson_8_Lucas_Handout.docx
@@ -146,7 +146,7 @@
                 <w:bCs/>
                 <w:color w:val="173C4E"/>
               </w:rPr>
-              <w:t xml:space="preserve">WEIGH</w:t>
+              <w:t xml:space="preserve">DECIDE</w:t>
             </w:r>
           </w:p>
           <w:p>
@@ -158,7 +158,7 @@
               <w:rPr>
                 <w:rFonts w:ascii="Arial" w:cs="Arial" w:eastAsia="Arial" w:hAnsi="Arial"/>
               </w:rPr>
-              <w:t xml:space="preserve">rule + rights + effects</w:t>
+              <w:t xml:space="preserve">strengths + risks</w:t>
             </w:r>
           </w:p>
         </w:tc>
@@ -192,7 +192,7 @@
                 <w:bCs/>
                 <w:color w:val="173C4E"/>
               </w:rPr>
-              <w:t xml:space="preserve">JUDGE</w:t>
+              <w:t xml:space="preserve">ARGUE</w:t>
             </w:r>
           </w:p>
           <w:p>
@@ -204,7 +204,7 @@
               <w:rPr>
                 <w:rFonts w:ascii="Arial" w:cs="Arial" w:eastAsia="Arial" w:hAnsi="Arial"/>
               </w:rPr>
-              <w:t xml:space="preserve">claim + evidence + counterpoint</w:t>
+              <w:t xml:space="preserve">claim + evidence + counter</w:t>
             </w:r>
           </w:p>
         </w:tc>

</xml_diff>

<commit_message>
feat: enhance Lesson 8 materials with structured opinion-building framework and updated evaluation criteria
</commit_message>
<xml_diff>
--- a/Units/English/English_Unit_3/Lesson_Plans/Lesson_8/Lesson_8_Lucas_Handout.docx
+++ b/Units/English/English_Unit_3/Lesson_Plans/Lesson_8/Lesson_8_Lucas_Handout.docx
@@ -47,7 +47,7 @@
           <w:sz w:val="23"/>
           <w:szCs w:val="23"/>
         </w:rPr>
-        <w:t xml:space="preserve">A visual choice pathway</w:t>
+        <w:t xml:space="preserve">Build your opinion - four writing parts</w:t>
       </w:r>
     </w:p>
     <w:tbl>
@@ -65,216 +65,15 @@
         <w:tblLayout w:type="fixed"/>
       </w:tblPr>
       <w:tblGrid>
-        <w:gridCol w:w="3120"/>
-        <w:gridCol w:w="3120"/>
-        <w:gridCol w:w="3120"/>
+        <w:gridCol w:w="2340"/>
+        <w:gridCol w:w="2340"/>
+        <w:gridCol w:w="2340"/>
+        <w:gridCol w:w="2340"/>
       </w:tblGrid>
       <w:tr>
         <w:tc>
           <w:tcPr>
-            <w:tcW w:type="dxa" w:w="3120"/>
-            <w:tcBorders>
-              <w:top w:val="single" w:color="B9CBC8" w:sz="6"/>
-              <w:left w:val="single" w:color="B9CBC8" w:sz="6"/>
-              <w:bottom w:val="single" w:color="B9CBC8" w:sz="6"/>
-              <w:right w:val="single" w:color="B9CBC8" w:sz="6"/>
-            </w:tcBorders>
-            <w:shd w:fill="DCEFE8" w:val="clear"/>
-            <w:tcMar>
-              <w:top w:type="dxa" w:w="100"/>
-              <w:left w:type="dxa" w:w="140"/>
-              <w:bottom w:type="dxa" w:w="100"/>
-              <w:right w:type="dxa" w:w="140"/>
-            </w:tcMar>
-            <w:vAlign w:val="center"/>
-          </w:tcPr>
-          <w:p>
-            <w:pPr>
-              <w:spacing w:after="20"/>
-              <w:jc w:val="center"/>
-            </w:pPr>
-            <w:r>
-              <w:rPr>
-                <w:rFonts w:ascii="Arial" w:cs="Arial" w:eastAsia="Arial" w:hAnsi="Arial"/>
-                <w:b/>
-                <w:bCs/>
-                <w:color w:val="173C4E"/>
-              </w:rPr>
-              <w:t xml:space="preserve">READ</w:t>
-            </w:r>
-          </w:p>
-          <w:p>
-            <w:pPr>
-              <w:spacing w:after="0"/>
-              <w:jc w:val="center"/>
-            </w:pPr>
-            <w:r>
-              <w:rPr>
-                <w:rFonts w:ascii="Arial" w:cs="Arial" w:eastAsia="Arial" w:hAnsi="Arial"/>
-              </w:rPr>
-              <w:t xml:space="preserve">pp. 33-41</w:t>
-            </w:r>
-          </w:p>
-        </w:tc>
-        <w:tc>
-          <w:tcPr>
-            <w:tcW w:type="dxa" w:w="3120"/>
-            <w:tcBorders>
-              <w:top w:val="single" w:color="B9CBC8" w:sz="6"/>
-              <w:left w:val="single" w:color="B9CBC8" w:sz="6"/>
-              <w:bottom w:val="single" w:color="B9CBC8" w:sz="6"/>
-              <w:right w:val="single" w:color="B9CBC8" w:sz="6"/>
-            </w:tcBorders>
-            <w:shd w:fill="DCEFE8" w:val="clear"/>
-            <w:tcMar>
-              <w:top w:type="dxa" w:w="100"/>
-              <w:left w:type="dxa" w:w="140"/>
-              <w:bottom w:type="dxa" w:w="100"/>
-              <w:right w:type="dxa" w:w="140"/>
-            </w:tcMar>
-            <w:vAlign w:val="center"/>
-          </w:tcPr>
-          <w:p>
-            <w:pPr>
-              <w:spacing w:after="20"/>
-              <w:jc w:val="center"/>
-            </w:pPr>
-            <w:r>
-              <w:rPr>
-                <w:rFonts w:ascii="Arial" w:cs="Arial" w:eastAsia="Arial" w:hAnsi="Arial"/>
-                <w:b/>
-                <w:bCs/>
-                <w:color w:val="173C4E"/>
-              </w:rPr>
-              <w:t xml:space="preserve">DECIDE</w:t>
-            </w:r>
-          </w:p>
-          <w:p>
-            <w:pPr>
-              <w:spacing w:after="0"/>
-              <w:jc w:val="center"/>
-            </w:pPr>
-            <w:r>
-              <w:rPr>
-                <w:rFonts w:ascii="Arial" w:cs="Arial" w:eastAsia="Arial" w:hAnsi="Arial"/>
-              </w:rPr>
-              <w:t xml:space="preserve">strengths + risks</w:t>
-            </w:r>
-          </w:p>
-        </w:tc>
-        <w:tc>
-          <w:tcPr>
-            <w:tcW w:type="dxa" w:w="3120"/>
-            <w:tcBorders>
-              <w:top w:val="single" w:color="B9CBC8" w:sz="6"/>
-              <w:left w:val="single" w:color="B9CBC8" w:sz="6"/>
-              <w:bottom w:val="single" w:color="B9CBC8" w:sz="6"/>
-              <w:right w:val="single" w:color="B9CBC8" w:sz="6"/>
-            </w:tcBorders>
-            <w:shd w:fill="DCEFE8" w:val="clear"/>
-            <w:tcMar>
-              <w:top w:type="dxa" w:w="100"/>
-              <w:left w:type="dxa" w:w="140"/>
-              <w:bottom w:type="dxa" w:w="100"/>
-              <w:right w:type="dxa" w:w="140"/>
-            </w:tcMar>
-            <w:vAlign w:val="center"/>
-          </w:tcPr>
-          <w:p>
-            <w:pPr>
-              <w:spacing w:after="20"/>
-              <w:jc w:val="center"/>
-            </w:pPr>
-            <w:r>
-              <w:rPr>
-                <w:rFonts w:ascii="Arial" w:cs="Arial" w:eastAsia="Arial" w:hAnsi="Arial"/>
-                <w:b/>
-                <w:bCs/>
-                <w:color w:val="173C4E"/>
-              </w:rPr>
-              <w:t xml:space="preserve">ARGUE</w:t>
-            </w:r>
-          </w:p>
-          <w:p>
-            <w:pPr>
-              <w:spacing w:after="0"/>
-              <w:jc w:val="center"/>
-            </w:pPr>
-            <w:r>
-              <w:rPr>
-                <w:rFonts w:ascii="Arial" w:cs="Arial" w:eastAsia="Arial" w:hAnsi="Arial"/>
-              </w:rPr>
-              <w:t xml:space="preserve">claim + evidence + counter</w:t>
-            </w:r>
-          </w:p>
-        </w:tc>
-      </w:tr>
-    </w:tbl>
-    <w:p>
-      <w:pPr>
-        <w:spacing w:after="100" w:before="170"/>
-      </w:pPr>
-      <w:r>
-        <w:rPr>
-          <w:rFonts w:ascii="Arial" w:cs="Arial" w:eastAsia="Arial" w:hAnsi="Arial"/>
-          <w:i/>
-          <w:iCs/>
-          <w:sz w:val="19"/>
-          <w:szCs w:val="19"/>
-        </w:rPr>
-        <w:t xml:space="preserve">Name: ____________________________________    Class: __________    Date: __________</w:t>
-      </w:r>
-    </w:p>
-    <w:p>
-      <w:pPr>
-        <w:pStyle w:val="Heading1"/>
-      </w:pPr>
-      <w:r>
-        <w:rPr>
-          <w:rFonts w:ascii="Arial" w:cs="Arial" w:eastAsia="Arial" w:hAnsi="Arial"/>
-          <w:color w:val="192B36"/>
-          <w:sz w:val="22"/>
-          <w:szCs w:val="22"/>
-        </w:rPr>
-        <w:t xml:space="preserve">Malia has a hard choice</w:t>
-      </w:r>
-    </w:p>
-    <w:p>
-      <w:pPr>
-        <w:spacing w:after="120" w:line="300" w:lineRule="auto"/>
-      </w:pPr>
-      <w:r>
-        <w:rPr>
-          <w:rFonts w:ascii="Arial" w:cs="Arial" w:eastAsia="Arial" w:hAnsi="Arial"/>
-          <w:i/>
-          <w:iCs/>
-        </w:rPr>
-        <w:t xml:space="preserve">Point, read, act or say each step.</w:t>
-      </w:r>
-    </w:p>
-    <w:tbl>
-      <w:tblPr>
-        <w:tblW w:type="dxa" w:w="9360"/>
-        <w:tblInd w:type="dxa" w:w="120"/>
-        <w:tblBorders>
-          <w:top w:val="single" w:color="auto" w:sz="4"/>
-          <w:left w:val="single" w:color="auto" w:sz="4"/>
-          <w:bottom w:val="single" w:color="auto" w:sz="4"/>
-          <w:right w:val="single" w:color="auto" w:sz="4"/>
-          <w:insideH w:val="single" w:color="auto" w:sz="4"/>
-          <w:insideV w:val="single" w:color="auto" w:sz="4"/>
-        </w:tblBorders>
-        <w:tblLayout w:type="fixed"/>
-      </w:tblPr>
-      <w:tblGrid>
-        <w:gridCol w:w="3120"/>
-        <w:gridCol w:w="3120"/>
-        <w:gridCol w:w="3120"/>
-      </w:tblGrid>
-      <w:tr>
-        <w:tc>
-          <w:tcPr>
-            <w:tcW w:type="dxa" w:w="3120"/>
+            <w:tcW w:type="dxa" w:w="2340"/>
             <w:tcBorders>
               <w:top w:val="single" w:color="20756E" w:sz="10"/>
               <w:left w:val="single" w:color="20756E" w:sz="10"/>
@@ -292,7 +91,7 @@
           </w:tcPr>
           <w:p>
             <w:pPr>
-              <w:spacing w:after="80"/>
+              <w:spacing w:after="0"/>
               <w:jc w:val="center"/>
             </w:pPr>
             <w:r>
@@ -301,35 +100,19 @@
                 <w:b/>
                 <w:bCs/>
                 <w:color w:val="173C4E"/>
-                <w:sz w:val="28"/>
-                <w:szCs w:val="28"/>
               </w:rPr>
-              <w:t xml:space="preserve">1  HELP</w:t>
-            </w:r>
-          </w:p>
-          <w:p>
-            <w:pPr>
-              <w:spacing w:after="0"/>
-              <w:jc w:val="center"/>
-            </w:pPr>
-            <w:r>
-              <w:rPr>
-                <w:rFonts w:ascii="Arial" w:cs="Arial" w:eastAsia="Arial" w:hAnsi="Arial"/>
-                <w:sz w:val="24"/>
-                <w:szCs w:val="24"/>
-              </w:rPr>
-              <w:t xml:space="preserve">Malia wants to help orangutans.</w:t>
+              <w:t xml:space="preserve">1 CLAIM</w:t>
             </w:r>
           </w:p>
         </w:tc>
         <w:tc>
           <w:tcPr>
-            <w:tcW w:type="dxa" w:w="3120"/>
+            <w:tcW w:type="dxa" w:w="2340"/>
             <w:tcBorders>
-              <w:top w:val="single" w:color="20756E" w:sz="10"/>
-              <w:left w:val="single" w:color="20756E" w:sz="10"/>
-              <w:bottom w:val="single" w:color="20756E" w:sz="10"/>
-              <w:right w:val="single" w:color="20756E" w:sz="10"/>
+              <w:top w:val="single" w:color="D8644A" w:sz="10"/>
+              <w:left w:val="single" w:color="D8644A" w:sz="10"/>
+              <w:bottom w:val="single" w:color="D8644A" w:sz="10"/>
+              <w:right w:val="single" w:color="D8644A" w:sz="10"/>
             </w:tcBorders>
             <w:shd w:fill="FFF8E7" w:val="clear"/>
             <w:tcMar>
@@ -342,7 +125,7 @@
           </w:tcPr>
           <w:p>
             <w:pPr>
-              <w:spacing w:after="80"/>
+              <w:spacing w:after="0"/>
               <w:jc w:val="center"/>
             </w:pPr>
             <w:r>
@@ -351,35 +134,19 @@
                 <w:b/>
                 <w:bCs/>
                 <w:color w:val="173C4E"/>
-                <w:sz w:val="28"/>
-                <w:szCs w:val="28"/>
               </w:rPr>
-              <w:t xml:space="preserve">2  WAIT</w:t>
-            </w:r>
-          </w:p>
-          <w:p>
-            <w:pPr>
-              <w:spacing w:after="0"/>
-              <w:jc w:val="center"/>
-            </w:pPr>
-            <w:r>
-              <w:rPr>
-                <w:rFonts w:ascii="Arial" w:cs="Arial" w:eastAsia="Arial" w:hAnsi="Arial"/>
-                <w:sz w:val="24"/>
-                <w:szCs w:val="24"/>
-              </w:rPr>
-              <w:t xml:space="preserve">Her teacher says: wait for permission.</w:t>
+              <w:t xml:space="preserve">2 EVIDENCE</w:t>
             </w:r>
           </w:p>
         </w:tc>
         <w:tc>
           <w:tcPr>
-            <w:tcW w:type="dxa" w:w="3120"/>
+            <w:tcW w:type="dxa" w:w="2340"/>
             <w:tcBorders>
-              <w:top w:val="single" w:color="20756E" w:sz="10"/>
-              <w:left w:val="single" w:color="20756E" w:sz="10"/>
-              <w:bottom w:val="single" w:color="20756E" w:sz="10"/>
-              <w:right w:val="single" w:color="20756E" w:sz="10"/>
+              <w:top w:val="single" w:color="E9B44C" w:sz="10"/>
+              <w:left w:val="single" w:color="E9B44C" w:sz="10"/>
+              <w:bottom w:val="single" w:color="E9B44C" w:sz="10"/>
+              <w:right w:val="single" w:color="E9B44C" w:sz="10"/>
             </w:tcBorders>
             <w:shd w:fill="F4F7F6" w:val="clear"/>
             <w:tcMar>
@@ -392,7 +159,7 @@
           </w:tcPr>
           <w:p>
             <w:pPr>
-              <w:spacing w:after="80"/>
+              <w:spacing w:after="0"/>
               <w:jc w:val="center"/>
             </w:pPr>
             <w:r>
@@ -401,12 +168,29 @@
                 <w:b/>
                 <w:bCs/>
                 <w:color w:val="173C4E"/>
-                <w:sz w:val="28"/>
-                <w:szCs w:val="28"/>
               </w:rPr>
-              <w:t xml:space="preserve">3  POST</w:t>
+              <w:t xml:space="preserve">3 COUNTER</w:t>
             </w:r>
           </w:p>
+        </w:tc>
+        <w:tc>
+          <w:tcPr>
+            <w:tcW w:type="dxa" w:w="2340"/>
+            <w:tcBorders>
+              <w:top w:val="single" w:color="173C4E" w:sz="10"/>
+              <w:left w:val="single" w:color="173C4E" w:sz="10"/>
+              <w:bottom w:val="single" w:color="173C4E" w:sz="10"/>
+              <w:right w:val="single" w:color="173C4E" w:sz="10"/>
+            </w:tcBorders>
+            <w:shd w:fill="DCEFE8" w:val="clear"/>
+            <w:tcMar>
+              <w:top w:type="dxa" w:w="100"/>
+              <w:left w:type="dxa" w:w="140"/>
+              <w:bottom w:type="dxa" w:w="100"/>
+              <w:right w:type="dxa" w:w="140"/>
+            </w:tcMar>
+            <w:vAlign w:val="center"/>
+          </w:tcPr>
           <w:p>
             <w:pPr>
               <w:spacing w:after="0"/>
@@ -415,10 +199,11 @@
             <w:r>
               <w:rPr>
                 <w:rFonts w:ascii="Arial" w:cs="Arial" w:eastAsia="Arial" w:hAnsi="Arial"/>
-                <w:sz w:val="24"/>
-                <w:szCs w:val="24"/>
+                <w:b/>
+                <w:bCs/>
+                <w:color w:val="173C4E"/>
               </w:rPr>
-              <w:t xml:space="preserve">Malia plans to put the petition online.</w:t>
+              <w:t xml:space="preserve">4 JUDGEMENT</w:t>
             </w:r>
           </w:p>
         </w:tc>
@@ -426,6 +211,49 @@
     </w:tbl>
     <w:p>
       <w:pPr>
+        <w:spacing w:after="100" w:before="170"/>
+      </w:pPr>
+      <w:r>
+        <w:rPr>
+          <w:rFonts w:ascii="Arial" w:cs="Arial" w:eastAsia="Arial" w:hAnsi="Arial"/>
+          <w:i/>
+          <w:iCs/>
+          <w:sz w:val="19"/>
+          <w:szCs w:val="19"/>
+        </w:rPr>
+        <w:t xml:space="preserve">Name: ____________________________________    Class: __________    Date: __________</w:t>
+      </w:r>
+    </w:p>
+    <w:p>
+      <w:pPr>
+        <w:spacing w:after="80" w:before="80"/>
+      </w:pPr>
+      <w:r>
+        <w:rPr>
+          <w:rFonts w:ascii="Arial" w:cs="Arial" w:eastAsia="Arial" w:hAnsi="Arial"/>
+          <w:b/>
+          <w:bCs/>
+          <w:sz w:val="26"/>
+          <w:szCs w:val="26"/>
+        </w:rPr>
+        <w:t xml:space="preserve">Big question: Should rules ever be bent to help animals?</w:t>
+      </w:r>
+    </w:p>
+    <w:p>
+      <w:pPr>
+        <w:spacing w:after="120"/>
+      </w:pPr>
+      <w:r>
+        <w:rPr>
+          <w:rFonts w:ascii="Arial" w:cs="Arial" w:eastAsia="Arial" w:hAnsi="Arial"/>
+          <w:sz w:val="22"/>
+          <w:szCs w:val="22"/>
+        </w:rPr>
+        <w:t xml:space="preserve">Write one short part at a time. You may speak your answer, or ask a partner to write your words.</w:t>
+      </w:r>
+    </w:p>
+    <w:p>
+      <w:pPr>
         <w:pStyle w:val="Heading1"/>
       </w:pPr>
       <w:r>
@@ -435,7 +263,7 @@
           <w:sz w:val="22"/>
           <w:szCs w:val="22"/>
         </w:rPr>
-        <w:t xml:space="preserve">What is the conflict?</w:t>
+        <w:t xml:space="preserve">1. Claim</w:t>
       </w:r>
     </w:p>
     <w:p>
@@ -445,24 +273,10 @@
       <w:r>
         <w:rPr>
           <w:rFonts w:ascii="Arial" w:cs="Arial" w:eastAsia="Arial" w:hAnsi="Arial"/>
-          <w:sz w:val="24"/>
-          <w:szCs w:val="24"/>
-        </w:rPr>
-        <w:t xml:space="preserve">Malia wants to ____________________.  The teacher wants Malia to ____________________.</w:t>
-      </w:r>
-    </w:p>
-    <w:p>
-      <w:pPr>
-        <w:pStyle w:val="Heading1"/>
-      </w:pPr>
-      <w:r>
-        <w:rPr>
-          <w:rFonts w:ascii="Arial" w:cs="Arial" w:eastAsia="Arial" w:hAnsi="Arial"/>
-          <w:color w:val="192B36"/>
           <w:sz w:val="22"/>
           <w:szCs w:val="22"/>
         </w:rPr>
-        <w:t xml:space="preserve">Choose one action</w:t>
+        <w:t xml:space="preserve">Say what you think. Use a limit word like usually, sometimes or only if.</w:t>
       </w:r>
     </w:p>
     <w:tbl>
@@ -480,119 +294,17 @@
         <w:tblLayout w:type="fixed"/>
       </w:tblPr>
       <w:tblGrid>
-        <w:gridCol w:w="3120"/>
-        <w:gridCol w:w="3120"/>
-        <w:gridCol w:w="3120"/>
+        <w:gridCol w:w="9360"/>
       </w:tblGrid>
       <w:tr>
         <w:tc>
           <w:tcPr>
-            <w:tcW w:type="dxa" w:w="3120"/>
+            <w:tcW w:type="dxa" w:w="9360"/>
             <w:tcBorders>
-              <w:top w:val="single" w:color="20756E" w:sz="10"/>
-              <w:left w:val="single" w:color="20756E" w:sz="10"/>
-              <w:bottom w:val="single" w:color="20756E" w:sz="10"/>
-              <w:right w:val="single" w:color="20756E" w:sz="10"/>
-            </w:tcBorders>
-            <w:shd w:fill="DCEFE8" w:val="clear"/>
-            <w:tcMar>
-              <w:top w:type="dxa" w:w="100"/>
-              <w:left w:type="dxa" w:w="140"/>
-              <w:bottom w:type="dxa" w:w="100"/>
-              <w:right w:type="dxa" w:w="140"/>
-            </w:tcMar>
-            <w:vAlign w:val="center"/>
-          </w:tcPr>
-          <w:p>
-            <w:pPr>
-              <w:spacing w:after="80"/>
-              <w:jc w:val="center"/>
-            </w:pPr>
-            <w:r>
-              <w:rPr>
-                <w:rFonts w:ascii="Arial" w:cs="Arial" w:eastAsia="Arial" w:hAnsi="Arial"/>
-                <w:b/>
-                <w:bCs/>
-                <w:color w:val="173C4E"/>
-                <w:sz w:val="28"/>
-                <w:szCs w:val="28"/>
-              </w:rPr>
-              <w:t xml:space="preserve">WAIT</w:t>
-            </w:r>
-          </w:p>
-          <w:p>
-            <w:pPr>
-              <w:spacing w:after="0"/>
-              <w:jc w:val="center"/>
-            </w:pPr>
-            <w:r>
-              <w:rPr>
-                <w:rFonts w:ascii="Arial" w:cs="Arial" w:eastAsia="Arial" w:hAnsi="Arial"/>
-                <w:sz w:val="24"/>
-                <w:szCs w:val="24"/>
-              </w:rPr>
-              <w:t xml:space="preserve">Follow the instruction.</w:t>
-            </w:r>
-          </w:p>
-        </w:tc>
-        <w:tc>
-          <w:tcPr>
-            <w:tcW w:type="dxa" w:w="3120"/>
-            <w:tcBorders>
-              <w:top w:val="single" w:color="20756E" w:sz="10"/>
-              <w:left w:val="single" w:color="20756E" w:sz="10"/>
-              <w:bottom w:val="single" w:color="20756E" w:sz="10"/>
-              <w:right w:val="single" w:color="20756E" w:sz="10"/>
-            </w:tcBorders>
-            <w:shd w:fill="FFF8E7" w:val="clear"/>
-            <w:tcMar>
-              <w:top w:type="dxa" w:w="100"/>
-              <w:left w:type="dxa" w:w="140"/>
-              <w:bottom w:type="dxa" w:w="100"/>
-              <w:right w:type="dxa" w:w="140"/>
-            </w:tcMar>
-            <w:vAlign w:val="center"/>
-          </w:tcPr>
-          <w:p>
-            <w:pPr>
-              <w:spacing w:after="80"/>
-              <w:jc w:val="center"/>
-            </w:pPr>
-            <w:r>
-              <w:rPr>
-                <w:rFonts w:ascii="Arial" w:cs="Arial" w:eastAsia="Arial" w:hAnsi="Arial"/>
-                <w:b/>
-                <w:bCs/>
-                <w:color w:val="173C4E"/>
-                <w:sz w:val="28"/>
-                <w:szCs w:val="28"/>
-              </w:rPr>
-              <w:t xml:space="preserve">ASK</w:t>
-            </w:r>
-          </w:p>
-          <w:p>
-            <w:pPr>
-              <w:spacing w:after="0"/>
-              <w:jc w:val="center"/>
-            </w:pPr>
-            <w:r>
-              <w:rPr>
-                <w:rFonts w:ascii="Arial" w:cs="Arial" w:eastAsia="Arial" w:hAnsi="Arial"/>
-                <w:sz w:val="24"/>
-                <w:szCs w:val="24"/>
-              </w:rPr>
-              <w:t xml:space="preserve">Find another approved way.</w:t>
-            </w:r>
-          </w:p>
-        </w:tc>
-        <w:tc>
-          <w:tcPr>
-            <w:tcW w:type="dxa" w:w="3120"/>
-            <w:tcBorders>
-              <w:top w:val="single" w:color="20756E" w:sz="10"/>
-              <w:left w:val="single" w:color="20756E" w:sz="10"/>
-              <w:bottom w:val="single" w:color="20756E" w:sz="10"/>
-              <w:right w:val="single" w:color="20756E" w:sz="10"/>
+              <w:top w:val="single" w:color="B9CBC8" w:sz="6"/>
+              <w:left w:val="single" w:color="B9CBC8" w:sz="6"/>
+              <w:bottom w:val="single" w:color="B9CBC8" w:sz="6"/>
+              <w:right w:val="single" w:color="B9CBC8" w:sz="6"/>
             </w:tcBorders>
             <w:shd w:fill="F4F7F6" w:val="clear"/>
             <w:tcMar>
@@ -605,33 +317,44 @@
           </w:tcPr>
           <w:p>
             <w:pPr>
-              <w:spacing w:after="80"/>
-              <w:jc w:val="center"/>
+              <w:spacing w:after="60"/>
             </w:pPr>
             <w:r>
               <w:rPr>
                 <w:rFonts w:ascii="Arial" w:cs="Arial" w:eastAsia="Arial" w:hAnsi="Arial"/>
                 <w:b/>
                 <w:bCs/>
-                <w:color w:val="173C4E"/>
-                <w:sz w:val="28"/>
-                <w:szCs w:val="28"/>
+                <w:color w:val="20756E"/>
+                <w:sz w:val="20"/>
+                <w:szCs w:val="20"/>
               </w:rPr>
-              <w:t xml:space="preserve">POST</w:t>
+              <w:t xml:space="preserve">Think first</w:t>
+            </w:r>
+          </w:p>
+          <w:p>
+            <w:pPr>
+              <w:spacing w:after="40"/>
+            </w:pPr>
+            <w:r>
+              <w:rPr>
+                <w:rFonts w:ascii="Arial" w:cs="Arial" w:eastAsia="Arial" w:hAnsi="Arial"/>
+                <w:sz w:val="22"/>
+                <w:szCs w:val="22"/>
+              </w:rPr>
+              <w:t xml:space="preserve">Do you think school rules should usually be followed?</w:t>
             </w:r>
           </w:p>
           <w:p>
             <w:pPr>
               <w:spacing w:after="0"/>
-              <w:jc w:val="center"/>
             </w:pPr>
             <w:r>
               <w:rPr>
                 <w:rFonts w:ascii="Arial" w:cs="Arial" w:eastAsia="Arial" w:hAnsi="Arial"/>
-                <w:sz w:val="24"/>
-                <w:szCs w:val="24"/>
+                <w:sz w:val="22"/>
+                <w:szCs w:val="22"/>
               </w:rPr>
-              <w:t xml:space="preserve">Use the class webpage.</w:t>
+              <w:t xml:space="preserve">When might it be okay to bend a rule for animals?</w:t>
             </w:r>
           </w:p>
         </w:tc>
@@ -639,30 +362,49 @@
     </w:tbl>
     <w:p>
       <w:pPr>
-        <w:spacing w:after="150" w:before="180"/>
+        <w:spacing w:after="40" w:before="80"/>
       </w:pPr>
       <w:r>
         <w:rPr>
           <w:rFonts w:ascii="Arial" w:cs="Arial" w:eastAsia="Arial" w:hAnsi="Arial"/>
           <w:b/>
           <w:bCs/>
-          <w:sz w:val="26"/>
-          <w:szCs w:val="26"/>
-        </w:rPr>
-        <w:t xml:space="preserve">I choose:  WAIT  /  ASK  /  POST</w:t>
-      </w:r>
-    </w:p>
-    <w:p>
-      <w:pPr>
-        <w:spacing w:after="120" w:line="300" w:lineRule="auto"/>
-      </w:pPr>
-      <w:r>
-        <w:rPr>
-          <w:rFonts w:ascii="Arial" w:cs="Arial" w:eastAsia="Arial" w:hAnsi="Arial"/>
+          <w:color w:val="5A6870"/>
+          <w:sz w:val="20"/>
+          <w:szCs w:val="20"/>
+        </w:rPr>
+        <w:t xml:space="preserve">Sentence starter:</w:t>
+      </w:r>
+    </w:p>
+    <w:p>
+      <w:pPr>
+        <w:spacing w:after="80"/>
+      </w:pPr>
+      <w:r>
+        <w:rPr>
+          <w:rFonts w:ascii="Arial" w:cs="Arial" w:eastAsia="Arial" w:hAnsi="Arial"/>
+          <w:i/>
+          <w:iCs/>
           <w:sz w:val="24"/>
           <w:szCs w:val="24"/>
         </w:rPr>
-        <w:t xml:space="preserve">Malia should __________________ because _______________________________________________.</w:t>
+        <w:t xml:space="preserve">Rules should usually be followed. Still, ...</w:t>
+      </w:r>
+    </w:p>
+    <w:p>
+      <w:pPr>
+        <w:spacing w:after="40"/>
+      </w:pPr>
+      <w:r>
+        <w:rPr>
+          <w:rFonts w:ascii="Arial" w:cs="Arial" w:eastAsia="Arial" w:hAnsi="Arial"/>
+          <w:b/>
+          <w:bCs/>
+          <w:color w:val="5A6870"/>
+          <w:sz w:val="20"/>
+          <w:szCs w:val="20"/>
+        </w:rPr>
+        <w:t xml:space="preserve">Write here:</w:t>
       </w:r>
     </w:p>
     <w:p>
@@ -694,8 +436,17 @@
       </w:r>
     </w:p>
     <w:p>
-      <w:r>
-        <w:br w:type="page"/>
+      <w:pPr>
+        <w:spacing w:after="80" w:before="70"/>
+      </w:pPr>
+      <w:r>
+        <w:rPr>
+          <w:rFonts w:ascii="Arial" w:cs="Arial" w:eastAsia="Arial" w:hAnsi="Arial"/>
+          <w:color w:val="5A6870"/>
+          <w:sz w:val="20"/>
+          <w:szCs w:val="20"/>
+        </w:rPr>
+        <w:t xml:space="preserve">________________________________________________________________________________</w:t>
       </w:r>
     </w:p>
     <w:p>
@@ -709,7 +460,20 @@
           <w:sz w:val="22"/>
           <w:szCs w:val="22"/>
         </w:rPr>
-        <w:t xml:space="preserve">Think about effects</w:t>
+        <w:t xml:space="preserve">2. Evidence</w:t>
+      </w:r>
+    </w:p>
+    <w:p>
+      <w:pPr>
+        <w:spacing w:after="120" w:line="300" w:lineRule="auto"/>
+      </w:pPr>
+      <w:r>
+        <w:rPr>
+          <w:rFonts w:ascii="Arial" w:cs="Arial" w:eastAsia="Arial" w:hAnsi="Arial"/>
+          <w:sz w:val="22"/>
+          <w:szCs w:val="22"/>
+        </w:rPr>
+        <w:t xml:space="preserve">Give one clear reason from what we talked about in class.</w:t>
       </w:r>
     </w:p>
     <w:tbl>
@@ -727,20 +491,19 @@
         <w:tblLayout w:type="fixed"/>
       </w:tblPr>
       <w:tblGrid>
-        <w:gridCol w:w="4680"/>
-        <w:gridCol w:w="4680"/>
+        <w:gridCol w:w="9360"/>
       </w:tblGrid>
       <w:tr>
         <w:tc>
           <w:tcPr>
-            <w:tcW w:type="dxa" w:w="4680"/>
+            <w:tcW w:type="dxa" w:w="9360"/>
             <w:tcBorders>
               <w:top w:val="single" w:color="B9CBC8" w:sz="6"/>
               <w:left w:val="single" w:color="B9CBC8" w:sz="6"/>
               <w:bottom w:val="single" w:color="B9CBC8" w:sz="6"/>
               <w:right w:val="single" w:color="B9CBC8" w:sz="6"/>
             </w:tcBorders>
-            <w:shd w:fill="DCEFE8" w:val="clear"/>
+            <w:shd w:fill="F4F7F6" w:val="clear"/>
             <w:tcMar>
               <w:top w:type="dxa" w:w="100"/>
               <w:left w:type="dxa" w:w="140"/>
@@ -751,8 +514,7 @@
           </w:tcPr>
           <w:p>
             <w:pPr>
-              <w:spacing w:after="50"/>
-              <w:jc w:val="center"/>
+              <w:spacing w:after="60"/>
             </w:pPr>
             <w:r>
               <w:rPr>
@@ -760,36 +522,190 @@
                 <w:b/>
                 <w:bCs/>
                 <w:color w:val="20756E"/>
-                <w:sz w:val="27"/>
-                <w:szCs w:val="27"/>
+                <w:sz w:val="20"/>
+                <w:szCs w:val="20"/>
               </w:rPr>
-              <w:t xml:space="preserve">HELP</w:t>
+              <w:t xml:space="preserve">Think first</w:t>
             </w:r>
           </w:p>
           <w:p>
             <w:pPr>
-              <w:spacing w:after="120" w:line="300" w:lineRule="auto"/>
+              <w:spacing w:after="40"/>
             </w:pPr>
             <w:r>
               <w:rPr>
                 <w:rFonts w:ascii="Arial" w:cs="Arial" w:eastAsia="Arial" w:hAnsi="Arial"/>
-                <w:sz w:val="24"/>
-                <w:szCs w:val="24"/>
+                <w:sz w:val="22"/>
+                <w:szCs w:val="22"/>
               </w:rPr>
-              <w:t xml:space="preserve">Who could this action help?</w:t>
+              <w:t xml:space="preserve">What did Mrs Harwono tell Malia to do?</w:t>
+            </w:r>
+          </w:p>
+          <w:p>
+            <w:pPr>
+              <w:spacing w:after="0"/>
+            </w:pPr>
+            <w:r>
+              <w:rPr>
+                <w:rFonts w:ascii="Arial" w:cs="Arial" w:eastAsia="Arial" w:hAnsi="Arial"/>
+                <w:sz w:val="22"/>
+                <w:szCs w:val="22"/>
+              </w:rPr>
+              <w:t xml:space="preserve">What did Malia want, or what did she plan to do?</w:t>
             </w:r>
           </w:p>
         </w:tc>
+      </w:tr>
+    </w:tbl>
+    <w:p>
+      <w:pPr>
+        <w:spacing w:after="40" w:before="80"/>
+      </w:pPr>
+      <w:r>
+        <w:rPr>
+          <w:rFonts w:ascii="Arial" w:cs="Arial" w:eastAsia="Arial" w:hAnsi="Arial"/>
+          <w:b/>
+          <w:bCs/>
+          <w:color w:val="5A6870"/>
+          <w:sz w:val="20"/>
+          <w:szCs w:val="20"/>
+        </w:rPr>
+        <w:t xml:space="preserve">Sentence starter:</w:t>
+      </w:r>
+    </w:p>
+    <w:p>
+      <w:pPr>
+        <w:spacing w:after="80"/>
+      </w:pPr>
+      <w:r>
+        <w:rPr>
+          <w:rFonts w:ascii="Arial" w:cs="Arial" w:eastAsia="Arial" w:hAnsi="Arial"/>
+          <w:i/>
+          <w:iCs/>
+          <w:sz w:val="24"/>
+          <w:szCs w:val="24"/>
+        </w:rPr>
+        <w:t xml:space="preserve">One thing that happened is ...</w:t>
+      </w:r>
+    </w:p>
+    <w:p>
+      <w:pPr>
+        <w:spacing w:after="40"/>
+      </w:pPr>
+      <w:r>
+        <w:rPr>
+          <w:rFonts w:ascii="Arial" w:cs="Arial" w:eastAsia="Arial" w:hAnsi="Arial"/>
+          <w:b/>
+          <w:bCs/>
+          <w:color w:val="5A6870"/>
+          <w:sz w:val="20"/>
+          <w:szCs w:val="20"/>
+        </w:rPr>
+        <w:t xml:space="preserve">Write here:</w:t>
+      </w:r>
+    </w:p>
+    <w:p>
+      <w:pPr>
+        <w:spacing w:after="80" w:before="70"/>
+      </w:pPr>
+      <w:r>
+        <w:rPr>
+          <w:rFonts w:ascii="Arial" w:cs="Arial" w:eastAsia="Arial" w:hAnsi="Arial"/>
+          <w:color w:val="5A6870"/>
+          <w:sz w:val="20"/>
+          <w:szCs w:val="20"/>
+        </w:rPr>
+        <w:t xml:space="preserve">________________________________________________________________________________</w:t>
+      </w:r>
+    </w:p>
+    <w:p>
+      <w:pPr>
+        <w:spacing w:after="80" w:before="70"/>
+      </w:pPr>
+      <w:r>
+        <w:rPr>
+          <w:rFonts w:ascii="Arial" w:cs="Arial" w:eastAsia="Arial" w:hAnsi="Arial"/>
+          <w:color w:val="5A6870"/>
+          <w:sz w:val="20"/>
+          <w:szCs w:val="20"/>
+        </w:rPr>
+        <w:t xml:space="preserve">________________________________________________________________________________</w:t>
+      </w:r>
+    </w:p>
+    <w:p>
+      <w:pPr>
+        <w:spacing w:after="80" w:before="70"/>
+      </w:pPr>
+      <w:r>
+        <w:rPr>
+          <w:rFonts w:ascii="Arial" w:cs="Arial" w:eastAsia="Arial" w:hAnsi="Arial"/>
+          <w:color w:val="5A6870"/>
+          <w:sz w:val="20"/>
+          <w:szCs w:val="20"/>
+        </w:rPr>
+        <w:t xml:space="preserve">________________________________________________________________________________</w:t>
+      </w:r>
+    </w:p>
+    <w:p>
+      <w:r>
+        <w:br w:type="page"/>
+      </w:r>
+    </w:p>
+    <w:p>
+      <w:pPr>
+        <w:pStyle w:val="Heading1"/>
+      </w:pPr>
+      <w:r>
+        <w:rPr>
+          <w:rFonts w:ascii="Arial" w:cs="Arial" w:eastAsia="Arial" w:hAnsi="Arial"/>
+          <w:color w:val="192B36"/>
+          <w:sz w:val="22"/>
+          <w:szCs w:val="22"/>
+        </w:rPr>
+        <w:t xml:space="preserve">3. Counter</w:t>
+      </w:r>
+    </w:p>
+    <w:p>
+      <w:pPr>
+        <w:spacing w:after="120" w:line="300" w:lineRule="auto"/>
+      </w:pPr>
+      <w:r>
+        <w:rPr>
+          <w:rFonts w:ascii="Arial" w:cs="Arial" w:eastAsia="Arial" w:hAnsi="Arial"/>
+          <w:sz w:val="22"/>
+          <w:szCs w:val="22"/>
+        </w:rPr>
+        <w:t xml:space="preserve">Say a fair reason someone may disagree with you.</w:t>
+      </w:r>
+    </w:p>
+    <w:tbl>
+      <w:tblPr>
+        <w:tblW w:type="dxa" w:w="9360"/>
+        <w:tblInd w:type="dxa" w:w="120"/>
+        <w:tblBorders>
+          <w:top w:val="single" w:color="auto" w:sz="4"/>
+          <w:left w:val="single" w:color="auto" w:sz="4"/>
+          <w:bottom w:val="single" w:color="auto" w:sz="4"/>
+          <w:right w:val="single" w:color="auto" w:sz="4"/>
+          <w:insideH w:val="single" w:color="auto" w:sz="4"/>
+          <w:insideV w:val="single" w:color="auto" w:sz="4"/>
+        </w:tblBorders>
+        <w:tblLayout w:type="fixed"/>
+      </w:tblPr>
+      <w:tblGrid>
+        <w:gridCol w:w="9360"/>
+      </w:tblGrid>
+      <w:tr>
         <w:tc>
           <w:tcPr>
-            <w:tcW w:type="dxa" w:w="4680"/>
+            <w:tcW w:type="dxa" w:w="9360"/>
             <w:tcBorders>
               <w:top w:val="single" w:color="B9CBC8" w:sz="6"/>
               <w:left w:val="single" w:color="B9CBC8" w:sz="6"/>
               <w:bottom w:val="single" w:color="B9CBC8" w:sz="6"/>
               <w:right w:val="single" w:color="B9CBC8" w:sz="6"/>
             </w:tcBorders>
-            <w:shd w:fill="FFF8E7" w:val="clear"/>
+            <w:shd w:fill="F4F7F6" w:val="clear"/>
             <w:tcMar>
               <w:top w:type="dxa" w:w="100"/>
               <w:left w:type="dxa" w:w="140"/>
@@ -800,32 +716,44 @@
           </w:tcPr>
           <w:p>
             <w:pPr>
-              <w:spacing w:after="50"/>
-              <w:jc w:val="center"/>
+              <w:spacing w:after="60"/>
             </w:pPr>
             <w:r>
               <w:rPr>
                 <w:rFonts w:ascii="Arial" w:cs="Arial" w:eastAsia="Arial" w:hAnsi="Arial"/>
                 <w:b/>
                 <w:bCs/>
-                <w:color w:val="D8644A"/>
-                <w:sz w:val="27"/>
-                <w:szCs w:val="27"/>
+                <w:color w:val="20756E"/>
+                <w:sz w:val="20"/>
+                <w:szCs w:val="20"/>
               </w:rPr>
-              <w:t xml:space="preserve">RISK</w:t>
+              <w:t xml:space="preserve">Think first</w:t>
             </w:r>
           </w:p>
           <w:p>
             <w:pPr>
-              <w:spacing w:after="120" w:line="300" w:lineRule="auto"/>
+              <w:spacing w:after="40"/>
             </w:pPr>
             <w:r>
               <w:rPr>
                 <w:rFonts w:ascii="Arial" w:cs="Arial" w:eastAsia="Arial" w:hAnsi="Arial"/>
-                <w:sz w:val="24"/>
-                <w:szCs w:val="24"/>
+                <w:sz w:val="22"/>
+                <w:szCs w:val="22"/>
               </w:rPr>
-              <w:t xml:space="preserve">Who could be upset or harmed?</w:t>
+              <w:t xml:space="preserve">Why might someone say Malia should wait?</w:t>
+            </w:r>
+          </w:p>
+          <w:p>
+            <w:pPr>
+              <w:spacing w:after="0"/>
+            </w:pPr>
+            <w:r>
+              <w:rPr>
+                <w:rFonts w:ascii="Arial" w:cs="Arial" w:eastAsia="Arial" w:hAnsi="Arial"/>
+                <w:sz w:val="22"/>
+                <w:szCs w:val="22"/>
+              </w:rPr>
+              <w:t xml:space="preserve">Why might someone say she should find another way, or post online?</w:t>
             </w:r>
           </w:p>
         </w:tc>
@@ -833,6 +761,53 @@
     </w:tbl>
     <w:p>
       <w:pPr>
+        <w:spacing w:after="40" w:before="80"/>
+      </w:pPr>
+      <w:r>
+        <w:rPr>
+          <w:rFonts w:ascii="Arial" w:cs="Arial" w:eastAsia="Arial" w:hAnsi="Arial"/>
+          <w:b/>
+          <w:bCs/>
+          <w:color w:val="5A6870"/>
+          <w:sz w:val="20"/>
+          <w:szCs w:val="20"/>
+        </w:rPr>
+        <w:t xml:space="preserve">Sentence starter:</w:t>
+      </w:r>
+    </w:p>
+    <w:p>
+      <w:pPr>
+        <w:spacing w:after="80"/>
+      </w:pPr>
+      <w:r>
+        <w:rPr>
+          <w:rFonts w:ascii="Arial" w:cs="Arial" w:eastAsia="Arial" w:hAnsi="Arial"/>
+          <w:i/>
+          <w:iCs/>
+          <w:sz w:val="24"/>
+          <w:szCs w:val="24"/>
+        </w:rPr>
+        <w:t xml:space="preserve">Someone might disagree because ...</w:t>
+      </w:r>
+    </w:p>
+    <w:p>
+      <w:pPr>
+        <w:spacing w:after="40"/>
+      </w:pPr>
+      <w:r>
+        <w:rPr>
+          <w:rFonts w:ascii="Arial" w:cs="Arial" w:eastAsia="Arial" w:hAnsi="Arial"/>
+          <w:b/>
+          <w:bCs/>
+          <w:color w:val="5A6870"/>
+          <w:sz w:val="20"/>
+          <w:szCs w:val="20"/>
+        </w:rPr>
+        <w:t xml:space="preserve">Write here:</w:t>
+      </w:r>
+    </w:p>
+    <w:p>
+      <w:pPr>
         <w:spacing w:after="80" w:before="70"/>
       </w:pPr>
       <w:r>
@@ -884,7 +859,7 @@
           <w:sz w:val="22"/>
           <w:szCs w:val="22"/>
         </w:rPr>
-        <w:t xml:space="preserve">My fair rule</w:t>
+        <w:t xml:space="preserve">4. Judgement</w:t>
       </w:r>
     </w:p>
     <w:p>
@@ -894,23 +869,180 @@
       <w:r>
         <w:rPr>
           <w:rFonts w:ascii="Arial" w:cs="Arial" w:eastAsia="Arial" w:hAnsi="Arial"/>
+          <w:sz w:val="22"/>
+          <w:szCs w:val="22"/>
+        </w:rPr>
+        <w:t xml:space="preserve">Finish with your final view and a clear limit.</w:t>
+      </w:r>
+    </w:p>
+    <w:tbl>
+      <w:tblPr>
+        <w:tblW w:type="dxa" w:w="9360"/>
+        <w:tblInd w:type="dxa" w:w="120"/>
+        <w:tblBorders>
+          <w:top w:val="single" w:color="auto" w:sz="4"/>
+          <w:left w:val="single" w:color="auto" w:sz="4"/>
+          <w:bottom w:val="single" w:color="auto" w:sz="4"/>
+          <w:right w:val="single" w:color="auto" w:sz="4"/>
+          <w:insideH w:val="single" w:color="auto" w:sz="4"/>
+          <w:insideV w:val="single" w:color="auto" w:sz="4"/>
+        </w:tblBorders>
+        <w:tblLayout w:type="fixed"/>
+      </w:tblPr>
+      <w:tblGrid>
+        <w:gridCol w:w="9360"/>
+      </w:tblGrid>
+      <w:tr>
+        <w:tc>
+          <w:tcPr>
+            <w:tcW w:type="dxa" w:w="9360"/>
+            <w:tcBorders>
+              <w:top w:val="single" w:color="B9CBC8" w:sz="6"/>
+              <w:left w:val="single" w:color="B9CBC8" w:sz="6"/>
+              <w:bottom w:val="single" w:color="B9CBC8" w:sz="6"/>
+              <w:right w:val="single" w:color="B9CBC8" w:sz="6"/>
+            </w:tcBorders>
+            <w:shd w:fill="F4F7F6" w:val="clear"/>
+            <w:tcMar>
+              <w:top w:type="dxa" w:w="100"/>
+              <w:left w:type="dxa" w:w="140"/>
+              <w:bottom w:type="dxa" w:w="100"/>
+              <w:right w:type="dxa" w:w="140"/>
+            </w:tcMar>
+            <w:vAlign w:val="center"/>
+          </w:tcPr>
+          <w:p>
+            <w:pPr>
+              <w:spacing w:after="60"/>
+            </w:pPr>
+            <w:r>
+              <w:rPr>
+                <w:rFonts w:ascii="Arial" w:cs="Arial" w:eastAsia="Arial" w:hAnsi="Arial"/>
+                <w:b/>
+                <w:bCs/>
+                <w:color w:val="20756E"/>
+                <w:sz w:val="20"/>
+                <w:szCs w:val="20"/>
+              </w:rPr>
+              <w:t xml:space="preserve">Think first</w:t>
+            </w:r>
+          </w:p>
+          <w:p>
+            <w:pPr>
+              <w:spacing w:after="40"/>
+            </w:pPr>
+            <w:r>
+              <w:rPr>
+                <w:rFonts w:ascii="Arial" w:cs="Arial" w:eastAsia="Arial" w:hAnsi="Arial"/>
+                <w:sz w:val="22"/>
+                <w:szCs w:val="22"/>
+              </w:rPr>
+              <w:t xml:space="preserve">What should Malia do: wait, ask another way, or post?</w:t>
+            </w:r>
+          </w:p>
+          <w:p>
+            <w:pPr>
+              <w:spacing w:after="0"/>
+            </w:pPr>
+            <w:r>
+              <w:rPr>
+                <w:rFonts w:ascii="Arial" w:cs="Arial" w:eastAsia="Arial" w:hAnsi="Arial"/>
+                <w:sz w:val="22"/>
+                <w:szCs w:val="22"/>
+              </w:rPr>
+              <w:t xml:space="preserve">What limit keeps your answer fair?</w:t>
+            </w:r>
+          </w:p>
+        </w:tc>
+      </w:tr>
+    </w:tbl>
+    <w:p>
+      <w:pPr>
+        <w:spacing w:after="40" w:before="80"/>
+      </w:pPr>
+      <w:r>
+        <w:rPr>
+          <w:rFonts w:ascii="Arial" w:cs="Arial" w:eastAsia="Arial" w:hAnsi="Arial"/>
+          <w:b/>
+          <w:bCs/>
+          <w:color w:val="5A6870"/>
+          <w:sz w:val="20"/>
+          <w:szCs w:val="20"/>
+        </w:rPr>
+        <w:t xml:space="preserve">Sentence starter:</w:t>
+      </w:r>
+    </w:p>
+    <w:p>
+      <w:pPr>
+        <w:spacing w:after="80"/>
+      </w:pPr>
+      <w:r>
+        <w:rPr>
+          <w:rFonts w:ascii="Arial" w:cs="Arial" w:eastAsia="Arial" w:hAnsi="Arial"/>
+          <w:i/>
+          <w:iCs/>
           <w:sz w:val="24"/>
           <w:szCs w:val="24"/>
         </w:rPr>
-        <w:t xml:space="preserve">It may be okay to bend a rule when ________________________________________________.</w:t>
-      </w:r>
-    </w:p>
-    <w:p>
-      <w:pPr>
-        <w:spacing w:after="120" w:line="300" w:lineRule="auto"/>
-      </w:pPr>
-      <w:r>
-        <w:rPr>
-          <w:rFonts w:ascii="Arial" w:cs="Arial" w:eastAsia="Arial" w:hAnsi="Arial"/>
-          <w:sz w:val="24"/>
-          <w:szCs w:val="24"/>
-        </w:rPr>
-        <w:t xml:space="preserve">I should also think about ___________________________________________________________.</w:t>
+        <w:t xml:space="preserve">So I think Malia should ... only if ...</w:t>
+      </w:r>
+    </w:p>
+    <w:p>
+      <w:pPr>
+        <w:spacing w:after="40"/>
+      </w:pPr>
+      <w:r>
+        <w:rPr>
+          <w:rFonts w:ascii="Arial" w:cs="Arial" w:eastAsia="Arial" w:hAnsi="Arial"/>
+          <w:b/>
+          <w:bCs/>
+          <w:color w:val="5A6870"/>
+          <w:sz w:val="20"/>
+          <w:szCs w:val="20"/>
+        </w:rPr>
+        <w:t xml:space="preserve">Write here:</w:t>
+      </w:r>
+    </w:p>
+    <w:p>
+      <w:pPr>
+        <w:spacing w:after="80" w:before="70"/>
+      </w:pPr>
+      <w:r>
+        <w:rPr>
+          <w:rFonts w:ascii="Arial" w:cs="Arial" w:eastAsia="Arial" w:hAnsi="Arial"/>
+          <w:color w:val="5A6870"/>
+          <w:sz w:val="20"/>
+          <w:szCs w:val="20"/>
+        </w:rPr>
+        <w:t xml:space="preserve">________________________________________________________________________________</w:t>
+      </w:r>
+    </w:p>
+    <w:p>
+      <w:pPr>
+        <w:spacing w:after="80" w:before="70"/>
+      </w:pPr>
+      <w:r>
+        <w:rPr>
+          <w:rFonts w:ascii="Arial" w:cs="Arial" w:eastAsia="Arial" w:hAnsi="Arial"/>
+          <w:color w:val="5A6870"/>
+          <w:sz w:val="20"/>
+          <w:szCs w:val="20"/>
+        </w:rPr>
+        <w:t xml:space="preserve">________________________________________________________________________________</w:t>
+      </w:r>
+    </w:p>
+    <w:p>
+      <w:pPr>
+        <w:spacing w:after="80" w:before="70"/>
+      </w:pPr>
+      <w:r>
+        <w:rPr>
+          <w:rFonts w:ascii="Arial" w:cs="Arial" w:eastAsia="Arial" w:hAnsi="Arial"/>
+          <w:color w:val="5A6870"/>
+          <w:sz w:val="20"/>
+          <w:szCs w:val="20"/>
+        </w:rPr>
+        <w:t xml:space="preserve">________________________________________________________________________________</w:t>
       </w:r>
     </w:p>
     <w:p>
@@ -924,12 +1056,51 @@
           <w:sz w:val="22"/>
           <w:szCs w:val="22"/>
         </w:rPr>
-        <w:t xml:space="preserve">Show your answer</w:t>
+        <w:t xml:space="preserve">Put it together</w:t>
       </w:r>
     </w:p>
     <w:p>
       <w:pPr>
         <w:spacing w:after="120" w:line="300" w:lineRule="auto"/>
+      </w:pPr>
+      <w:r>
+        <w:rPr>
+          <w:rFonts w:ascii="Arial" w:cs="Arial" w:eastAsia="Arial" w:hAnsi="Arial"/>
+          <w:sz w:val="22"/>
+          <w:szCs w:val="22"/>
+        </w:rPr>
+        <w:t xml:space="preserve">Check your four parts in order. They should sound like one short opinion.</w:t>
+      </w:r>
+    </w:p>
+    <w:p>
+      <w:pPr>
+        <w:spacing w:before="80"/>
+      </w:pPr>
+      <w:r>
+        <w:rPr>
+          <w:rFonts w:ascii="Arial" w:cs="Arial" w:eastAsia="Arial" w:hAnsi="Arial"/>
+          <w:sz w:val="24"/>
+          <w:szCs w:val="24"/>
+        </w:rPr>
+        <w:t xml:space="preserve">My final limit: It may be okay to bend a rule when ______________________________,</w:t>
+      </w:r>
+    </w:p>
+    <w:p>
+      <w:pPr>
+        <w:spacing w:after="120" w:line="300" w:lineRule="auto"/>
+      </w:pPr>
+      <w:r>
+        <w:rPr>
+          <w:rFonts w:ascii="Arial" w:cs="Arial" w:eastAsia="Arial" w:hAnsi="Arial"/>
+          <w:sz w:val="24"/>
+          <w:szCs w:val="24"/>
+        </w:rPr>
+        <w:t xml:space="preserve">provided that _____________________________________________________________________.</w:t>
+      </w:r>
+    </w:p>
+    <w:p>
+      <w:pPr>
+        <w:spacing w:before="160"/>
       </w:pPr>
       <w:r>
         <w:rPr>
@@ -937,8 +1108,8 @@
           <w:b/>
           <w:bCs/>
           <w:color w:val="20756E"/>
-          <w:sz w:val="24"/>
-          <w:szCs w:val="24"/>
+          <w:sz w:val="22"/>
+          <w:szCs w:val="22"/>
         </w:rPr>
         <w:t xml:space="preserve">You may point, circle, speak, copy or ask a partner to write your words.</w:t>
       </w:r>
@@ -1080,7 +1251,7 @@
         <w:sz w:val="16"/>
         <w:szCs w:val="16"/>
       </w:rPr>
-      <w:t xml:space="preserve">ENGLISH UNIT 3  |  VISUAL PATHWAY</w:t>
+      <w:t xml:space="preserve">ENGLISH UNIT 3  |  WRITING PATHWAY</w:t>
     </w:r>
   </w:p>
 </w:hdr>

</xml_diff>